<commit_message>
Publish current site version
</commit_message>
<xml_diff>
--- a/assets/documents/new-generation-service-contract.docx
+++ b/assets/documents/new-generation-service-contract.docx
@@ -68,7 +68,20 @@
         <w:pStyle w:val="BodyText"/>
       </w:pPr>
       <w:r>
-        <w:t>1.3. Занятия могут проводиться очно только при взаимном согласии Сторон либо дистанционно с использованием онлайн-платформы ProgressMe/Edvibe, кабинета ученика и сервисов видеосвязи. Продолжительность одного занятия составляет 60 или 90 минут в зависимости от выбранного формата.</w:t>
+        <w:t xml:space="preserve">1.3. Занятия могут проводиться очно только при взаимном согласии Сторон либо дистанционно с использованием онлайн-платформы </w:t>
+      </w:r>
+      <w:del w:id="101" w:author="Claude" w:date="2026-05-02T00:00:00Z">
+        <w:r>
+          <w:delText xml:space="preserve">ProgressMe/Edvibe</w:delText>
+        </w:r>
+      </w:del>
+      <w:ins w:id="102" w:author="Claude" w:date="2026-05-02T00:00:00Z">
+        <w:r>
+          <w:t xml:space="preserve">ProgressMe, Edvibe или иных, согласованных Сторонами,</w:t>
+        </w:r>
+      </w:ins>
+      <w:r>
+        <w:t xml:space="preserve">, кабинета ученика и сервисов видеосвязи. Продолжительность одного занятия составляет 60 или 90 минут в зависимости от выбранного формата.</w:t>
       </w:r>
     </w:p>
     <w:p>
@@ -618,8 +631,23 @@
         <w:pStyle w:val="BodyText"/>
       </w:pPr>
       <w:r>
-        <w:t>9.2. Претензии и существенные вопросы по договору направляются в письменной форме на электронную почту или в иной согласованный канал связи. Стороны стремятся урегулировать спор путем переговоров.</w:t>
+        <w:t xml:space="preserve">9.2. Претензии и существенные вопросы по договору направляются в письменной форме на электронную почту или в иной согласованный канал связи. Стороны стремятся урегулировать спор путем переговоров.</w:t>
       </w:r>
+      <w:ins w:id="108" w:author="Claude" w:date="2026-05-02T00:00:00Z">
+        <w:r>
+          <w:t xml:space="preserve"> Срок рассмотрения претензии — 10 (десять) рабочих дней с момента её получения.</w:t>
+        </w:r>
+      </w:ins>
+    </w:p>
+    <w:p>
+      <w:pPr>
+        <w:pStyle w:val="BodyText"/>
+      </w:pPr>
+      <w:ins w:id="110" w:author="Claude" w:date="2026-05-02T00:00:00Z">
+        <w:r>
+          <w:t>9.3. Споры, не урегулированные в претензионном порядке, разрешаются в суде по месту нахождения Исполнителя в соответствии с законодательством Российской Федерации.</w:t>
+        </w:r>
+      </w:ins>
     </w:p>
     <w:p>
       <w:pPr>

</xml_diff>